<commit_message>
Update the excersice files
</commit_message>
<xml_diff>
--- a/35.ExamPreparation(24.11.23)/Fundamentals-Final-Exam-Preparation-Problems-Description-2.docx
+++ b/35.ExamPreparation(24.11.23)/Fundamentals-Final-Exam-Preparation-Problems-Description-2.docx
@@ -1,6 +1,6 @@
 
 <file path=word/document.xml><?xml version="1.0" encoding="utf-8"?>
-<w:document xmlns:wpc="http://schemas.microsoft.com/office/word/2010/wordprocessingCanvas" xmlns:cx="http://schemas.microsoft.com/office/drawing/2014/chartex" xmlns:cx1="http://schemas.microsoft.com/office/drawing/2015/9/8/chartex" xmlns:cx2="http://schemas.microsoft.com/office/drawing/2015/10/21/chartex" xmlns:cx3="http://schemas.microsoft.com/office/drawing/2016/5/9/chartex" xmlns:cx4="http://schemas.microsoft.com/office/drawing/2016/5/10/chartex" xmlns:cx5="http://schemas.microsoft.com/office/drawing/2016/5/11/chartex" xmlns:cx6="http://schemas.microsoft.com/office/drawing/2016/5/12/chartex" xmlns:cx7="http://schemas.microsoft.com/office/drawing/2016/5/13/chartex" xmlns:cx8="http://schemas.microsoft.com/office/drawing/2016/5/14/chartex" xmlns:mc="http://schemas.openxmlformats.org/markup-compatibility/2006" xmlns:aink="http://schemas.microsoft.com/office/drawing/2016/ink" xmlns:am3d="http://schemas.microsoft.com/office/drawing/2017/model3d" xmlns:o="urn:schemas-microsoft-com:office:office" xmlns:oel="http://schemas.microsoft.com/office/2019/extlst" xmlns:r="http://schemas.openxmlformats.org/officeDocument/2006/relationships" xmlns:m="http://schemas.openxmlformats.org/officeDocument/2006/math" xmlns:v="urn:schemas-microsoft-com:vml" xmlns:wp14="http://schemas.microsoft.com/office/word/2010/wordprocessingDrawing" xmlns:wp="http://schemas.openxmlformats.org/drawingml/2006/wordprocessingDrawing" xmlns:w10="urn:schemas-microsoft-com:office:word" xmlns:w="http://schemas.openxmlformats.org/wordprocessingml/2006/main" xmlns:w14="http://schemas.microsoft.com/office/word/2010/wordml" xmlns:w15="http://schemas.microsoft.com/office/word/2012/wordml" xmlns:w16cex="http://schemas.microsoft.com/office/word/2018/wordml/cex" xmlns:w16cid="http://schemas.microsoft.com/office/word/2016/wordml/cid" xmlns:w16="http://schemas.microsoft.com/office/word/2018/wordml" xmlns:w16sdtdh="http://schemas.microsoft.com/office/word/2020/wordml/sdtdatahash" xmlns:w16se="http://schemas.microsoft.com/office/word/2015/wordml/symex" xmlns:wpg="http://schemas.microsoft.com/office/word/2010/wordprocessingGroup" xmlns:wpi="http://schemas.microsoft.com/office/word/2010/wordprocessingInk" xmlns:wne="http://schemas.microsoft.com/office/word/2006/wordml" xmlns:wps="http://schemas.microsoft.com/office/word/2010/wordprocessingShape" mc:Ignorable="w14 w15 w16se w16cid w16 w16cex w16sdtdh wp14">
+<w:document xmlns:wpc="http://schemas.microsoft.com/office/word/2010/wordprocessingCanvas" xmlns:cx="http://schemas.microsoft.com/office/drawing/2014/chartex" xmlns:cx1="http://schemas.microsoft.com/office/drawing/2015/9/8/chartex" xmlns:cx2="http://schemas.microsoft.com/office/drawing/2015/10/21/chartex" xmlns:cx3="http://schemas.microsoft.com/office/drawing/2016/5/9/chartex" xmlns:cx4="http://schemas.microsoft.com/office/drawing/2016/5/10/chartex" xmlns:cx5="http://schemas.microsoft.com/office/drawing/2016/5/11/chartex" xmlns:cx6="http://schemas.microsoft.com/office/drawing/2016/5/12/chartex" xmlns:cx7="http://schemas.microsoft.com/office/drawing/2016/5/13/chartex" xmlns:cx8="http://schemas.microsoft.com/office/drawing/2016/5/14/chartex" xmlns:mc="http://schemas.openxmlformats.org/markup-compatibility/2006" xmlns:aink="http://schemas.microsoft.com/office/drawing/2016/ink" xmlns:am3d="http://schemas.microsoft.com/office/drawing/2017/model3d" xmlns:o="urn:schemas-microsoft-com:office:office" xmlns:oel="http://schemas.microsoft.com/office/2019/extlst" xmlns:r="http://schemas.openxmlformats.org/officeDocument/2006/relationships" xmlns:m="http://schemas.openxmlformats.org/officeDocument/2006/math" xmlns:v="urn:schemas-microsoft-com:vml" xmlns:wp14="http://schemas.microsoft.com/office/word/2010/wordprocessingDrawing" xmlns:wp="http://schemas.openxmlformats.org/drawingml/2006/wordprocessingDrawing" xmlns:w10="urn:schemas-microsoft-com:office:word" xmlns:w="http://schemas.openxmlformats.org/wordprocessingml/2006/main" xmlns:w14="http://schemas.microsoft.com/office/word/2010/wordml" xmlns:w15="http://schemas.microsoft.com/office/word/2012/wordml" xmlns:w16cex="http://schemas.microsoft.com/office/word/2018/wordml/cex" xmlns:w16cid="http://schemas.microsoft.com/office/word/2016/wordml/cid" xmlns:w16="http://schemas.microsoft.com/office/word/2018/wordml" xmlns:w16du="http://schemas.microsoft.com/office/word/2023/wordml/word16du" xmlns:w16sdtdh="http://schemas.microsoft.com/office/word/2020/wordml/sdtdatahash" xmlns:w16se="http://schemas.microsoft.com/office/word/2015/wordml/symex" xmlns:wpg="http://schemas.microsoft.com/office/word/2010/wordprocessingGroup" xmlns:wpi="http://schemas.microsoft.com/office/word/2010/wordprocessingInk" xmlns:wne="http://schemas.microsoft.com/office/word/2006/wordml" xmlns:wps="http://schemas.microsoft.com/office/word/2010/wordprocessingShape" mc:Ignorable="w14 w15 w16se w16cid w16 w16cex w16sdtdh w16du wp14">
   <w:body>
     <w:p>
       <w:pPr>
@@ -49,126 +49,51 @@
     <w:p>
       <w:pPr>
         <w:spacing w:before="0" w:after="0" w:line="240" w:lineRule="auto"/>
-        <w:ind w:left="360"/>
         <w:jc w:val="center"/>
+      </w:pPr>
+      <w:bookmarkStart w:id="0" w:name="_Hlk83306864"/>
+      <w:r>
         <w:rPr>
           <w:lang w:val="bg-BG"/>
         </w:rPr>
-      </w:pPr>
-      <w:bookmarkStart w:id="0" w:name="_Hlk83306864"/>
-      <w:r>
-        <w:t>A</w:t>
+        <w:t xml:space="preserve">Submit your solutions in the SoftUni </w:t>
+      </w:r>
+      <w:r>
+        <w:t>J</w:t>
       </w:r>
       <w:r>
         <w:rPr>
           <w:lang w:val="bg-BG"/>
         </w:rPr>
-        <w:t xml:space="preserve"> </w:t>
-      </w:r>
-      <w:r>
-        <w:t>p</w:t>
-      </w:r>
-      <w:r>
-        <w:rPr>
-          <w:lang w:val="bg-BG"/>
-        </w:rPr>
-        <w:t xml:space="preserve">roblem for </w:t>
-      </w:r>
-      <w:r>
-        <w:t>exam preparation</w:t>
-      </w:r>
-      <w:r>
-        <w:rPr>
-          <w:lang w:val="bg-BG"/>
-        </w:rPr>
-        <w:t xml:space="preserve"> for the </w:t>
-      </w:r>
-      <w:bookmarkStart w:id="1" w:name="_GoBack1"/>
+        <w:t xml:space="preserve">udge system </w:t>
+      </w:r>
+      <w:r>
+        <w:fldChar w:fldCharType="begin"/>
+      </w:r>
+      <w:r>
+        <w:instrText>HYPERLINK "https://alpha.judge.softuni.org/contests/05-programming-fundamentals-final-exam/2302/practice" \l "1"</w:instrText>
+      </w:r>
+      <w:r>
+        <w:fldChar w:fldCharType="separate"/>
+      </w:r>
       <w:r>
         <w:rPr>
           <w:rStyle w:val="InternetLink"/>
         </w:rPr>
-        <w:fldChar w:fldCharType="begin"/>
+        <w:t>her</w:t>
       </w:r>
       <w:r>
         <w:rPr>
           <w:rStyle w:val="InternetLink"/>
         </w:rPr>
-        <w:instrText>HYPERLINK "https://softuni.bg/trainings/4219/programming-fundamentals-with-csharp-september-2023"</w:instrText>
+        <w:t>e</w:t>
       </w:r>
       <w:r>
         <w:rPr>
           <w:rStyle w:val="InternetLink"/>
         </w:rPr>
-      </w:r>
-      <w:r>
-        <w:rPr>
-          <w:rStyle w:val="InternetLink"/>
-        </w:rPr>
-        <w:fldChar w:fldCharType="separate"/>
-      </w:r>
-      <w:r>
-        <w:rPr>
-          <w:rStyle w:val="Hyperlink"/>
-        </w:rPr>
-        <w:t xml:space="preserve">Programming </w:t>
-      </w:r>
-      <w:r>
-        <w:rPr>
-          <w:rStyle w:val="Hyperlink"/>
-          <w:lang w:val="bg-BG"/>
-        </w:rPr>
-        <w:t>Fundamentals Course @</w:t>
-      </w:r>
-      <w:r>
-        <w:rPr>
-          <w:rStyle w:val="Hyperlink"/>
-        </w:rPr>
-        <w:t xml:space="preserve"> </w:t>
-      </w:r>
-      <w:r>
-        <w:rPr>
-          <w:rStyle w:val="Hyperlink"/>
-          <w:lang w:val="bg-BG"/>
-        </w:rPr>
-        <w:t>SoftUni</w:t>
-      </w:r>
-      <w:bookmarkEnd w:id="1"/>
-      <w:r>
-        <w:rPr>
-          <w:rStyle w:val="InternetLink"/>
-        </w:rPr>
         <w:fldChar w:fldCharType="end"/>
       </w:r>
-    </w:p>
-    <w:p>
-      <w:pPr>
-        <w:spacing w:before="0" w:after="0" w:line="240" w:lineRule="auto"/>
-        <w:jc w:val="center"/>
-      </w:pPr>
-      <w:r>
-        <w:rPr>
-          <w:lang w:val="bg-BG"/>
-        </w:rPr>
-        <w:t xml:space="preserve">Submit your solutions in the SoftUni </w:t>
-      </w:r>
-      <w:r>
-        <w:t>J</w:t>
-      </w:r>
-      <w:r>
-        <w:rPr>
-          <w:lang w:val="bg-BG"/>
-        </w:rPr>
-        <w:t xml:space="preserve">udge system </w:t>
-      </w:r>
-      <w:hyperlink r:id="rId8" w:anchor="0" w:history="1">
-        <w:r>
-          <w:rPr>
-            <w:rStyle w:val="InternetLink"/>
-          </w:rPr>
-          <w:t>here</w:t>
-        </w:r>
-      </w:hyperlink>
       <w:bookmarkEnd w:id="0"/>
     </w:p>
     <w:p>
@@ -1198,12 +1123,14 @@
               </w:rPr>
               <w:t xml:space="preserve">becomes </w:t>
             </w:r>
+            <w:proofErr w:type="spellStart"/>
             <w:r>
               <w:rPr>
                 <w:rFonts w:ascii="Consolas" w:eastAsia="Calibri" w:hAnsi="Consolas" w:cstheme="minorHAnsi"/>
               </w:rPr>
               <w:t>abghijklmnopqrstuvwxyz</w:t>
             </w:r>
+            <w:proofErr w:type="spellEnd"/>
           </w:p>
           <w:p>
             <w:pPr>
@@ -1240,6 +1167,7 @@
                 <w:noProof/>
               </w:rPr>
             </w:pPr>
+            <w:proofErr w:type="spellStart"/>
             <w:r>
               <w:rPr>
                 <w:rFonts w:ascii="Consolas" w:eastAsia="Calibri" w:hAnsi="Consolas" w:cstheme="minorHAnsi"/>
@@ -1259,12 +1187,14 @@
               </w:rPr>
               <w:t>stuvwxyz</w:t>
             </w:r>
+            <w:proofErr w:type="spellEnd"/>
             <w:r>
               <w:rPr>
                 <w:rFonts w:eastAsia="Calibri" w:cstheme="minorHAnsi"/>
               </w:rPr>
               <w:t xml:space="preserve"> becomes </w:t>
             </w:r>
+            <w:proofErr w:type="spellStart"/>
             <w:r>
               <w:rPr>
                 <w:rFonts w:ascii="Consolas" w:eastAsia="Calibri" w:hAnsi="Consolas" w:cstheme="minorHAnsi"/>
@@ -1284,6 +1214,7 @@
               </w:rPr>
               <w:t>stuvwxyz</w:t>
             </w:r>
+            <w:proofErr w:type="spellEnd"/>
           </w:p>
           <w:p>
             <w:pPr>
@@ -1319,6 +1250,7 @@
                 <w:rFonts w:eastAsia="Calibri" w:cstheme="minorHAnsi"/>
               </w:rPr>
             </w:pPr>
+            <w:proofErr w:type="spellStart"/>
             <w:r>
               <w:rPr>
                 <w:rFonts w:ascii="Consolas" w:eastAsia="Calibri" w:hAnsi="Consolas" w:cstheme="minorHAnsi"/>
@@ -1338,12 +1270,14 @@
               </w:rPr>
               <w:t>LMNOPQRstuvwxyz</w:t>
             </w:r>
+            <w:proofErr w:type="spellEnd"/>
             <w:r>
               <w:rPr>
                 <w:rFonts w:eastAsia="Calibri" w:cstheme="minorHAnsi"/>
               </w:rPr>
               <w:t xml:space="preserve"> becomes </w:t>
             </w:r>
+            <w:proofErr w:type="spellStart"/>
             <w:r>
               <w:rPr>
                 <w:rFonts w:ascii="Consolas" w:eastAsia="Calibri" w:hAnsi="Consolas" w:cstheme="minorHAnsi"/>
@@ -1363,6 +1297,7 @@
               </w:rPr>
               <w:t>LMNOPQRstuvwxyz</w:t>
             </w:r>
+            <w:proofErr w:type="spellEnd"/>
           </w:p>
           <w:p>
             <w:pPr>
@@ -1398,12 +1333,14 @@
                 <w:rFonts w:eastAsia="Calibri" w:cstheme="minorHAnsi"/>
               </w:rPr>
             </w:pPr>
+            <w:proofErr w:type="spellStart"/>
             <w:r>
               <w:rPr>
                 <w:rFonts w:ascii="Consolas" w:eastAsia="Calibri" w:hAnsi="Consolas" w:cstheme="minorHAnsi"/>
               </w:rPr>
               <w:t>abgHIjkLMNOPQRstuvwxyz</w:t>
             </w:r>
+            <w:proofErr w:type="spellEnd"/>
             <w:r>
               <w:rPr>
                 <w:rFonts w:eastAsia="Calibri" w:cstheme="minorHAnsi"/>
@@ -1451,24 +1388,28 @@
                 <w:rFonts w:eastAsia="Calibri" w:cstheme="minorHAnsi"/>
               </w:rPr>
             </w:pPr>
+            <w:proofErr w:type="spellStart"/>
             <w:r>
               <w:rPr>
                 <w:rFonts w:ascii="Consolas" w:eastAsia="Calibri" w:hAnsi="Consolas" w:cstheme="minorHAnsi"/>
               </w:rPr>
               <w:t>abgHIjkLMNOPQRstuvwxyz</w:t>
             </w:r>
+            <w:proofErr w:type="spellEnd"/>
             <w:r>
               <w:rPr>
                 <w:rFonts w:eastAsia="Calibri" w:cstheme="minorHAnsi"/>
               </w:rPr>
               <w:t xml:space="preserve"> does not contain </w:t>
             </w:r>
+            <w:proofErr w:type="spellStart"/>
             <w:r>
               <w:rPr>
                 <w:rFonts w:ascii="Consolas" w:eastAsia="Calibri" w:hAnsi="Consolas" w:cstheme="minorHAnsi"/>
               </w:rPr>
               <w:t>deF</w:t>
             </w:r>
+            <w:proofErr w:type="spellEnd"/>
           </w:p>
           <w:p>
             <w:pPr>
@@ -1488,12 +1429,14 @@
               </w:rPr>
               <w:t xml:space="preserve">The final activation key is </w:t>
             </w:r>
+            <w:proofErr w:type="spellStart"/>
             <w:r>
               <w:rPr>
                 <w:rFonts w:ascii="Consolas" w:eastAsia="Calibri" w:hAnsi="Consolas" w:cstheme="minorHAnsi"/>
               </w:rPr>
               <w:t>abgHIjkLMNOPQRstuvwxyz</w:t>
             </w:r>
+            <w:proofErr w:type="spellEnd"/>
           </w:p>
         </w:tc>
       </w:tr>
@@ -1826,142 +1769,166 @@
           <w:lang w:val="en-GB"/>
         </w:rPr>
       </w:pPr>
-      <w:r>
-        <w:rPr>
-          <w:lang w:val="en-GB"/>
-        </w:rPr>
-        <w:t xml:space="preserve">Problem 2 </w:t>
-      </w:r>
-      <w:r>
-        <w:rPr>
-          <w:lang w:val="en-GB"/>
-        </w:rPr>
-        <w:t>–</w:t>
-      </w:r>
-      <w:r>
-        <w:rPr>
-          <w:lang w:val="en-GB"/>
-        </w:rPr>
-        <w:t xml:space="preserve"> </w:t>
-      </w:r>
-      <w:r>
-        <w:rPr>
-          <w:lang w:val="en-GB"/>
-        </w:rPr>
-        <w:t>Emoji Detector</w:t>
-      </w:r>
     </w:p>
     <w:p>
       <w:pPr>
+        <w:spacing w:before="0" w:after="200"/>
+        <w:rPr>
+          <w:rFonts w:eastAsiaTheme="majorEastAsia" w:cstheme="majorBidi"/>
+          <w:b/>
+          <w:bCs/>
+          <w:color w:val="7C380A"/>
+          <w:sz w:val="36"/>
+          <w:szCs w:val="36"/>
+          <w:lang w:val="en-GB"/>
+        </w:rPr>
+      </w:pPr>
+      <w:r>
+        <w:rPr>
+          <w:lang w:val="en-GB"/>
+        </w:rPr>
+        <w:br w:type="page"/>
+      </w:r>
+    </w:p>
+    <w:p>
+      <w:pPr>
+        <w:pStyle w:val="Heading2"/>
+        <w:numPr>
+          <w:ilvl w:val="0"/>
+          <w:numId w:val="0"/>
+        </w:numPr>
+        <w:ind w:left="360"/>
+        <w:jc w:val="center"/>
+        <w:rPr>
+          <w:lang w:val="en-GB"/>
+        </w:rPr>
+      </w:pPr>
+      <w:r>
+        <w:rPr>
+          <w:lang w:val="en-GB"/>
+        </w:rPr>
+        <w:lastRenderedPageBreak/>
+        <w:t xml:space="preserve">Problem 2 </w:t>
+      </w:r>
+      <w:r>
+        <w:rPr>
+          <w:lang w:val="en-GB"/>
+        </w:rPr>
+        <w:t>–</w:t>
+      </w:r>
+      <w:r>
+        <w:rPr>
+          <w:lang w:val="en-GB"/>
+        </w:rPr>
+        <w:t xml:space="preserve"> </w:t>
+      </w:r>
+      <w:r>
+        <w:rPr>
+          <w:lang w:val="en-GB"/>
+        </w:rPr>
+        <w:t>Emoji Detector</w:t>
+      </w:r>
+    </w:p>
+    <w:p>
+      <w:pPr>
         <w:spacing w:before="0" w:after="0" w:line="240" w:lineRule="auto"/>
         <w:jc w:val="center"/>
         <w:rPr>
+          <w:rStyle w:val="Hyperlink"/>
+        </w:rPr>
+      </w:pPr>
+      <w:r>
+        <w:rPr>
           <w:lang w:val="bg-BG"/>
         </w:rPr>
-      </w:pPr>
-      <w:r>
-        <w:t>A p</w:t>
+        <w:t xml:space="preserve">Submit your solutions in the SoftUni </w:t>
+      </w:r>
+      <w:r>
+        <w:t>J</w:t>
       </w:r>
       <w:r>
         <w:rPr>
           <w:lang w:val="bg-BG"/>
         </w:rPr>
-        <w:t xml:space="preserve">roblem for </w:t>
-      </w:r>
-      <w:r>
-        <w:t>exam preparation</w:t>
-      </w:r>
-      <w:r>
-        <w:rPr>
-          <w:lang w:val="bg-BG"/>
-        </w:rPr>
-        <w:t xml:space="preserve"> for the </w:t>
-      </w:r>
-      <w:hyperlink r:id="rId9" w:history="1">
-        <w:r>
-          <w:rPr>
-            <w:rStyle w:val="InternetLink"/>
-          </w:rPr>
-          <w:t xml:space="preserve">Programming </w:t>
-        </w:r>
-        <w:r>
-          <w:rPr>
-            <w:rStyle w:val="InternetLink"/>
-            <w:lang w:val="bg-BG"/>
-          </w:rPr>
-          <w:t>Fundamentals Course @</w:t>
-        </w:r>
-        <w:r>
-          <w:rPr>
-            <w:rStyle w:val="InternetLink"/>
-          </w:rPr>
-          <w:t xml:space="preserve"> </w:t>
-        </w:r>
-        <w:r>
-          <w:rPr>
-            <w:rStyle w:val="InternetLink"/>
-            <w:lang w:val="bg-BG"/>
-          </w:rPr>
-          <w:t>SoftUni</w:t>
-        </w:r>
-      </w:hyperlink>
+        <w:t xml:space="preserve">udge system </w:t>
+      </w:r>
+      <w:r>
+        <w:rPr>
+          <w:rStyle w:val="InternetLink"/>
+        </w:rPr>
+        <w:fldChar w:fldCharType="begin"/>
+      </w:r>
+      <w:r>
+        <w:rPr>
+          <w:rStyle w:val="InternetLink"/>
+        </w:rPr>
+        <w:instrText>HYPERLINK "https://alpha.judge.softuni.org/contests/05-programming-fundamentals-final-exam/2302/practice" \l "2"</w:instrText>
+      </w:r>
+      <w:r>
+        <w:rPr>
+          <w:rStyle w:val="InternetLink"/>
+        </w:rPr>
+      </w:r>
+      <w:r>
+        <w:rPr>
+          <w:rStyle w:val="InternetLink"/>
+        </w:rPr>
+        <w:fldChar w:fldCharType="separate"/>
+      </w:r>
+      <w:r>
+        <w:rPr>
+          <w:rStyle w:val="Hyperlink"/>
+        </w:rPr>
+        <w:t>here</w:t>
+      </w:r>
     </w:p>
     <w:p>
       <w:pPr>
-        <w:spacing w:before="0" w:after="0" w:line="240" w:lineRule="auto"/>
-        <w:jc w:val="center"/>
-      </w:pPr>
-      <w:r>
-        <w:rPr>
-          <w:lang w:val="bg-BG"/>
-        </w:rPr>
-        <w:t xml:space="preserve">Submit your solutions in the SoftUni </w:t>
-      </w:r>
-      <w:r>
-        <w:t>J</w:t>
-      </w:r>
-      <w:r>
-        <w:rPr>
-          <w:lang w:val="bg-BG"/>
-        </w:rPr>
-        <w:t xml:space="preserve">udge system </w:t>
-      </w:r>
-      <w:hyperlink r:id="rId10" w:anchor="1" w:history="1">
-        <w:r>
-          <w:rPr>
-            <w:rStyle w:val="InternetLink"/>
-          </w:rPr>
-          <w:t>here</w:t>
-        </w:r>
-      </w:hyperlink>
+        <w:rPr>
+          <w:rStyle w:val="Hyperlink"/>
+          <w:lang w:val="en-GB"/>
+        </w:rPr>
+      </w:pPr>
     </w:p>
     <w:p>
-      <w:pPr>
-        <w:rPr>
-          <w:lang w:val="en-GB"/>
-        </w:rPr>
-      </w:pPr>
+      <w:r>
+        <w:rPr>
+          <w:rStyle w:val="Hyperlink"/>
+        </w:rPr>
+        <w:t>Your task is to write a program that extracts em</w:t>
+      </w:r>
+      <w:r>
+        <w:rPr>
+          <w:rStyle w:val="InternetLink"/>
+        </w:rPr>
+        <w:fldChar w:fldCharType="end"/>
+      </w:r>
+      <w:r>
+        <w:t>ojis from a text and find</w:t>
+      </w:r>
+      <w:r>
+        <w:t>s</w:t>
+      </w:r>
+      <w:r>
+        <w:t xml:space="preserve"> the threshold based on the input.</w:t>
+      </w:r>
     </w:p>
     <w:p>
-      <w:r>
-        <w:lastRenderedPageBreak/>
-        <w:t>Your task is to write a program that extracts emojis from a text and find</w:t>
-      </w:r>
-      <w:r>
-        <w:t>s</w:t>
-      </w:r>
-      <w:r>
-        <w:t xml:space="preserve"> the threshold based on the input.</w:t>
-      </w:r>
-    </w:p>
-    <w:p>
       <w:pPr>
         <w:rPr>
           <w:lang w:val="bg-BG"/>
         </w:rPr>
       </w:pPr>
       <w:r>
-        <w:t>You have to get your</w:t>
+        <w:t xml:space="preserve">You </w:t>
+      </w:r>
+      <w:proofErr w:type="gramStart"/>
+      <w:r>
+        <w:t>have to</w:t>
+      </w:r>
+      <w:proofErr w:type="gramEnd"/>
+      <w:r>
+        <w:t xml:space="preserve"> get your</w:t>
       </w:r>
       <w:r>
         <w:rPr>
@@ -2688,7 +2655,6 @@
               <w:rPr>
                 <w:b/>
               </w:rPr>
-              <w:lastRenderedPageBreak/>
               <w:t>Input</w:t>
             </w:r>
           </w:p>
@@ -3950,7 +3916,15 @@
                 <w:rFonts w:ascii="Consolas" w:eastAsia="Calibri" w:hAnsi="Consolas" w:cs="Times New Roman"/>
                 <w:noProof/>
               </w:rPr>
-              <w:t xml:space="preserve">is that it has a more-or-less normal 3 distribution of 8 letters, as opposed to using 'Content here, content 99 here', making it look like readable </w:t>
+              <w:t xml:space="preserve">is that it has a more-or-less normal 3 distribution of 8 letters, as opposed to using 'Content </w:t>
+            </w:r>
+            <w:r>
+              <w:rPr>
+                <w:rFonts w:ascii="Consolas" w:eastAsia="Calibri" w:hAnsi="Consolas" w:cs="Times New Roman"/>
+                <w:noProof/>
+              </w:rPr>
+              <w:lastRenderedPageBreak/>
+              <w:t xml:space="preserve">here, content 99 here', making it look like readable </w:t>
             </w:r>
             <w:r>
               <w:rPr>
@@ -3994,6 +3968,7 @@
                 <w:rFonts w:ascii="Consolas" w:eastAsia="Calibri" w:hAnsi="Consolas" w:cs="Times New Roman"/>
                 <w:noProof/>
               </w:rPr>
+              <w:lastRenderedPageBreak/>
               <w:t>Cool</w:t>
             </w:r>
             <w:r>
@@ -4063,7 +4038,6 @@
                 <w:b/>
                 <w:szCs w:val="24"/>
               </w:rPr>
-              <w:lastRenderedPageBreak/>
               <w:t>Comments</w:t>
             </w:r>
           </w:p>
@@ -4201,97 +4175,53 @@
     <w:p>
       <w:pPr>
         <w:spacing w:before="0" w:after="0" w:line="240" w:lineRule="auto"/>
-        <w:ind w:left="360"/>
         <w:jc w:val="center"/>
+      </w:pPr>
+      <w:r>
         <w:rPr>
           <w:lang w:val="bg-BG"/>
         </w:rPr>
-      </w:pPr>
-      <w:r>
-        <w:t>A p</w:t>
+        <w:t xml:space="preserve">Submit your solutions in the SoftUni </w:t>
+      </w:r>
+      <w:r>
+        <w:t>J</w:t>
       </w:r>
       <w:r>
         <w:rPr>
           <w:lang w:val="bg-BG"/>
         </w:rPr>
-        <w:t xml:space="preserve">roblem for </w:t>
-      </w:r>
-      <w:r>
-        <w:t>exam preparation</w:t>
-      </w:r>
-      <w:r>
-        <w:rPr>
-          <w:lang w:val="bg-BG"/>
-        </w:rPr>
-        <w:t xml:space="preserve"> for the </w:t>
-      </w:r>
-      <w:hyperlink r:id="rId11" w:history="1">
+        <w:t xml:space="preserve">udge system </w:t>
+      </w:r>
+      <w:hyperlink r:id="rId8" w:anchor="30" w:history="1">
         <w:r>
           <w:rPr>
             <w:rStyle w:val="InternetLink"/>
           </w:rPr>
-          <w:t xml:space="preserve">Programming </w:t>
-        </w:r>
-        <w:r>
-          <w:rPr>
-            <w:rStyle w:val="InternetLink"/>
-            <w:lang w:val="bg-BG"/>
-          </w:rPr>
-          <w:t>Fundamentals Course @</w:t>
+          <w:t>h</w:t>
         </w:r>
         <w:r>
           <w:rPr>
             <w:rStyle w:val="InternetLink"/>
           </w:rPr>
-          <w:t xml:space="preserve"> </w:t>
+          <w:t>e</w:t>
         </w:r>
         <w:r>
           <w:rPr>
             <w:rStyle w:val="InternetLink"/>
-            <w:lang w:val="bg-BG"/>
           </w:rPr>
-          <w:t>SoftUni</w:t>
+          <w:t>re</w:t>
         </w:r>
       </w:hyperlink>
     </w:p>
     <w:p>
       <w:pPr>
-        <w:spacing w:before="0" w:after="0" w:line="240" w:lineRule="auto"/>
-        <w:jc w:val="center"/>
-      </w:pPr>
-      <w:r>
-        <w:rPr>
-          <w:lang w:val="bg-BG"/>
-        </w:rPr>
-        <w:t xml:space="preserve">Submit your solutions in the SoftUni </w:t>
-      </w:r>
-      <w:r>
-        <w:t>J</w:t>
-      </w:r>
-      <w:r>
-        <w:rPr>
-          <w:lang w:val="bg-BG"/>
-        </w:rPr>
-        <w:t xml:space="preserve">udge system </w:t>
-      </w:r>
-      <w:hyperlink r:id="rId12" w:anchor="2" w:history="1">
-        <w:r>
-          <w:rPr>
-            <w:rStyle w:val="InternetLink"/>
-          </w:rPr>
-          <w:t>here</w:t>
-        </w:r>
-      </w:hyperlink>
+        <w:rPr>
+          <w:lang w:val="en-GB"/>
+        </w:rPr>
+      </w:pPr>
     </w:p>
     <w:p>
       <w:pPr>
-        <w:rPr>
-          <w:lang w:val="en-GB"/>
-        </w:rPr>
-      </w:pPr>
-    </w:p>
-    <w:p>
-      <w:pPr>
         <w:jc w:val="center"/>
         <w:rPr>
           <w:i/>
@@ -4303,7 +4233,23 @@
           <w:i/>
           <w:lang w:val="en-GB"/>
         </w:rPr>
-        <w:t>You got your hands on the most recent update on the best MMORPG of all time – Heroes of Code and Logic. You want to play it all day long! So cancel all other arrangements and create your party!</w:t>
+        <w:t xml:space="preserve">You got your hands on the most recent update on the best MMORPG of all time – Heroes of Code and Logic. You want to play it all day long! </w:t>
+      </w:r>
+      <w:proofErr w:type="gramStart"/>
+      <w:r>
+        <w:rPr>
+          <w:i/>
+          <w:lang w:val="en-GB"/>
+        </w:rPr>
+        <w:t>So</w:t>
+      </w:r>
+      <w:proofErr w:type="gramEnd"/>
+      <w:r>
+        <w:rPr>
+          <w:i/>
+          <w:lang w:val="en-GB"/>
+        </w:rPr>
+        <w:t xml:space="preserve"> cancel all other arrangements and create your party!</w:t>
       </w:r>
     </w:p>
     <w:p>
@@ -4928,6 +4874,7 @@
         </w:rPr>
       </w:pPr>
       <w:r>
+        <w:lastRenderedPageBreak/>
         <w:t xml:space="preserve"> Print the following message:</w:t>
       </w:r>
     </w:p>
@@ -5001,7 +4948,6 @@
         </w:rPr>
       </w:pPr>
       <w:r>
-        <w:lastRenderedPageBreak/>
         <w:t xml:space="preserve">The hero increases his HP. If a command is given that would bring the HP of the hero above the </w:t>
       </w:r>
       <w:r>
@@ -5771,6 +5717,7 @@
                 <w:noProof/>
                 <w:highlight w:val="yellow"/>
               </w:rPr>
+              <w:lastRenderedPageBreak/>
               <w:t xml:space="preserve">  MP: 170</w:t>
             </w:r>
           </w:p>
@@ -5824,7 +5771,6 @@
                 <w:noProof/>
                 <w:highlight w:val="yellow"/>
               </w:rPr>
-              <w:lastRenderedPageBreak/>
               <w:t xml:space="preserve">  MP: 35</w:t>
             </w:r>
           </w:p>
@@ -6528,12 +6474,12 @@
       </w:pPr>
     </w:p>
     <w:sectPr>
-      <w:headerReference w:type="even" r:id="rId13"/>
-      <w:headerReference w:type="default" r:id="rId14"/>
-      <w:footerReference w:type="even" r:id="rId15"/>
-      <w:footerReference w:type="default" r:id="rId16"/>
-      <w:headerReference w:type="first" r:id="rId17"/>
-      <w:footerReference w:type="first" r:id="rId18"/>
+      <w:headerReference w:type="even" r:id="rId9"/>
+      <w:headerReference w:type="default" r:id="rId10"/>
+      <w:footerReference w:type="even" r:id="rId11"/>
+      <w:footerReference w:type="default" r:id="rId12"/>
+      <w:headerReference w:type="first" r:id="rId13"/>
+      <w:footerReference w:type="first" r:id="rId14"/>
       <w:pgSz w:w="11909" w:h="16834" w:code="9"/>
       <w:pgMar w:top="567" w:right="737" w:bottom="1077" w:left="737" w:header="567" w:footer="794" w:gutter="0"/>
       <w:cols w:space="720"/>
@@ -6544,7 +6490,7 @@
 </file>
 
 <file path=word/endnotes.xml><?xml version="1.0" encoding="utf-8"?>
-<w:endnotes xmlns:wpc="http://schemas.microsoft.com/office/word/2010/wordprocessingCanvas" xmlns:cx="http://schemas.microsoft.com/office/drawing/2014/chartex" xmlns:cx1="http://schemas.microsoft.com/office/drawing/2015/9/8/chartex" xmlns:cx2="http://schemas.microsoft.com/office/drawing/2015/10/21/chartex" xmlns:cx3="http://schemas.microsoft.com/office/drawing/2016/5/9/chartex" xmlns:cx4="http://schemas.microsoft.com/office/drawing/2016/5/10/chartex" xmlns:cx5="http://schemas.microsoft.com/office/drawing/2016/5/11/chartex" xmlns:cx6="http://schemas.microsoft.com/office/drawing/2016/5/12/chartex" xmlns:cx7="http://schemas.microsoft.com/office/drawing/2016/5/13/chartex" xmlns:cx8="http://schemas.microsoft.com/office/drawing/2016/5/14/chartex" xmlns:mc="http://schemas.openxmlformats.org/markup-compatibility/2006" xmlns:aink="http://schemas.microsoft.com/office/drawing/2016/ink" xmlns:am3d="http://schemas.microsoft.com/office/drawing/2017/model3d" xmlns:o="urn:schemas-microsoft-com:office:office" xmlns:oel="http://schemas.microsoft.com/office/2019/extlst" xmlns:r="http://schemas.openxmlformats.org/officeDocument/2006/relationships" xmlns:m="http://schemas.openxmlformats.org/officeDocument/2006/math" xmlns:v="urn:schemas-microsoft-com:vml" xmlns:wp14="http://schemas.microsoft.com/office/word/2010/wordprocessingDrawing" xmlns:wp="http://schemas.openxmlformats.org/drawingml/2006/wordprocessingDrawing" xmlns:w10="urn:schemas-microsoft-com:office:word" xmlns:w="http://schemas.openxmlformats.org/wordprocessingml/2006/main" xmlns:w14="http://schemas.microsoft.com/office/word/2010/wordml" xmlns:w15="http://schemas.microsoft.com/office/word/2012/wordml" xmlns:w16cex="http://schemas.microsoft.com/office/word/2018/wordml/cex" xmlns:w16cid="http://schemas.microsoft.com/office/word/2016/wordml/cid" xmlns:w16="http://schemas.microsoft.com/office/word/2018/wordml" xmlns:w16sdtdh="http://schemas.microsoft.com/office/word/2020/wordml/sdtdatahash" xmlns:w16se="http://schemas.microsoft.com/office/word/2015/wordml/symex" xmlns:wpg="http://schemas.microsoft.com/office/word/2010/wordprocessingGroup" xmlns:wpi="http://schemas.microsoft.com/office/word/2010/wordprocessingInk" xmlns:wne="http://schemas.microsoft.com/office/word/2006/wordml" xmlns:wps="http://schemas.microsoft.com/office/word/2010/wordprocessingShape" mc:Ignorable="w14 w15 w16se w16cid w16 w16cex w16sdtdh wp14">
+<w:endnotes xmlns:wpc="http://schemas.microsoft.com/office/word/2010/wordprocessingCanvas" xmlns:cx="http://schemas.microsoft.com/office/drawing/2014/chartex" xmlns:cx1="http://schemas.microsoft.com/office/drawing/2015/9/8/chartex" xmlns:cx2="http://schemas.microsoft.com/office/drawing/2015/10/21/chartex" xmlns:cx3="http://schemas.microsoft.com/office/drawing/2016/5/9/chartex" xmlns:cx4="http://schemas.microsoft.com/office/drawing/2016/5/10/chartex" xmlns:cx5="http://schemas.microsoft.com/office/drawing/2016/5/11/chartex" xmlns:cx6="http://schemas.microsoft.com/office/drawing/2016/5/12/chartex" xmlns:cx7="http://schemas.microsoft.com/office/drawing/2016/5/13/chartex" xmlns:cx8="http://schemas.microsoft.com/office/drawing/2016/5/14/chartex" xmlns:mc="http://schemas.openxmlformats.org/markup-compatibility/2006" xmlns:aink="http://schemas.microsoft.com/office/drawing/2016/ink" xmlns:am3d="http://schemas.microsoft.com/office/drawing/2017/model3d" xmlns:o="urn:schemas-microsoft-com:office:office" xmlns:oel="http://schemas.microsoft.com/office/2019/extlst" xmlns:r="http://schemas.openxmlformats.org/officeDocument/2006/relationships" xmlns:m="http://schemas.openxmlformats.org/officeDocument/2006/math" xmlns:v="urn:schemas-microsoft-com:vml" xmlns:wp14="http://schemas.microsoft.com/office/word/2010/wordprocessingDrawing" xmlns:wp="http://schemas.openxmlformats.org/drawingml/2006/wordprocessingDrawing" xmlns:w10="urn:schemas-microsoft-com:office:word" xmlns:w="http://schemas.openxmlformats.org/wordprocessingml/2006/main" xmlns:w14="http://schemas.microsoft.com/office/word/2010/wordml" xmlns:w15="http://schemas.microsoft.com/office/word/2012/wordml" xmlns:w16cex="http://schemas.microsoft.com/office/word/2018/wordml/cex" xmlns:w16cid="http://schemas.microsoft.com/office/word/2016/wordml/cid" xmlns:w16="http://schemas.microsoft.com/office/word/2018/wordml" xmlns:w16du="http://schemas.microsoft.com/office/word/2023/wordml/word16du" xmlns:w16sdtdh="http://schemas.microsoft.com/office/word/2020/wordml/sdtdatahash" xmlns:w16se="http://schemas.microsoft.com/office/word/2015/wordml/symex" xmlns:wpg="http://schemas.microsoft.com/office/word/2010/wordprocessingGroup" xmlns:wpi="http://schemas.microsoft.com/office/word/2010/wordprocessingInk" xmlns:wne="http://schemas.microsoft.com/office/word/2006/wordml" xmlns:wps="http://schemas.microsoft.com/office/word/2010/wordprocessingShape" mc:Ignorable="w14 w15 w16se w16cid w16 w16cex w16sdtdh w16du wp14">
   <w:endnote w:type="separator" w:id="-1">
     <w:p>
       <w:pPr>
@@ -6569,7 +6515,7 @@
 </file>
 
 <file path=word/footer1.xml><?xml version="1.0" encoding="utf-8"?>
-<w:ftr xmlns:wpc="http://schemas.microsoft.com/office/word/2010/wordprocessingCanvas" xmlns:cx="http://schemas.microsoft.com/office/drawing/2014/chartex" xmlns:cx1="http://schemas.microsoft.com/office/drawing/2015/9/8/chartex" xmlns:cx2="http://schemas.microsoft.com/office/drawing/2015/10/21/chartex" xmlns:cx3="http://schemas.microsoft.com/office/drawing/2016/5/9/chartex" xmlns:cx4="http://schemas.microsoft.com/office/drawing/2016/5/10/chartex" xmlns:cx5="http://schemas.microsoft.com/office/drawing/2016/5/11/chartex" xmlns:cx6="http://schemas.microsoft.com/office/drawing/2016/5/12/chartex" xmlns:cx7="http://schemas.microsoft.com/office/drawing/2016/5/13/chartex" xmlns:cx8="http://schemas.microsoft.com/office/drawing/2016/5/14/chartex" xmlns:mc="http://schemas.openxmlformats.org/markup-compatibility/2006" xmlns:aink="http://schemas.microsoft.com/office/drawing/2016/ink" xmlns:am3d="http://schemas.microsoft.com/office/drawing/2017/model3d" xmlns:o="urn:schemas-microsoft-com:office:office" xmlns:oel="http://schemas.microsoft.com/office/2019/extlst" xmlns:r="http://schemas.openxmlformats.org/officeDocument/2006/relationships" xmlns:m="http://schemas.openxmlformats.org/officeDocument/2006/math" xmlns:v="urn:schemas-microsoft-com:vml" xmlns:wp14="http://schemas.microsoft.com/office/word/2010/wordprocessingDrawing" xmlns:wp="http://schemas.openxmlformats.org/drawingml/2006/wordprocessingDrawing" xmlns:w10="urn:schemas-microsoft-com:office:word" xmlns:w="http://schemas.openxmlformats.org/wordprocessingml/2006/main" xmlns:w14="http://schemas.microsoft.com/office/word/2010/wordml" xmlns:w15="http://schemas.microsoft.com/office/word/2012/wordml" xmlns:w16cex="http://schemas.microsoft.com/office/word/2018/wordml/cex" xmlns:w16cid="http://schemas.microsoft.com/office/word/2016/wordml/cid" xmlns:w16="http://schemas.microsoft.com/office/word/2018/wordml" xmlns:w16sdtdh="http://schemas.microsoft.com/office/word/2020/wordml/sdtdatahash" xmlns:w16se="http://schemas.microsoft.com/office/word/2015/wordml/symex" xmlns:wpg="http://schemas.microsoft.com/office/word/2010/wordprocessingGroup" xmlns:wpi="http://schemas.microsoft.com/office/word/2010/wordprocessingInk" xmlns:wne="http://schemas.microsoft.com/office/word/2006/wordml" xmlns:wps="http://schemas.microsoft.com/office/word/2010/wordprocessingShape" mc:Ignorable="w14 w15 w16se w16cid w16 w16cex w16sdtdh wp14">
+<w:ftr xmlns:wpc="http://schemas.microsoft.com/office/word/2010/wordprocessingCanvas" xmlns:cx="http://schemas.microsoft.com/office/drawing/2014/chartex" xmlns:cx1="http://schemas.microsoft.com/office/drawing/2015/9/8/chartex" xmlns:cx2="http://schemas.microsoft.com/office/drawing/2015/10/21/chartex" xmlns:cx3="http://schemas.microsoft.com/office/drawing/2016/5/9/chartex" xmlns:cx4="http://schemas.microsoft.com/office/drawing/2016/5/10/chartex" xmlns:cx5="http://schemas.microsoft.com/office/drawing/2016/5/11/chartex" xmlns:cx6="http://schemas.microsoft.com/office/drawing/2016/5/12/chartex" xmlns:cx7="http://schemas.microsoft.com/office/drawing/2016/5/13/chartex" xmlns:cx8="http://schemas.microsoft.com/office/drawing/2016/5/14/chartex" xmlns:mc="http://schemas.openxmlformats.org/markup-compatibility/2006" xmlns:aink="http://schemas.microsoft.com/office/drawing/2016/ink" xmlns:am3d="http://schemas.microsoft.com/office/drawing/2017/model3d" xmlns:o="urn:schemas-microsoft-com:office:office" xmlns:oel="http://schemas.microsoft.com/office/2019/extlst" xmlns:r="http://schemas.openxmlformats.org/officeDocument/2006/relationships" xmlns:m="http://schemas.openxmlformats.org/officeDocument/2006/math" xmlns:v="urn:schemas-microsoft-com:vml" xmlns:wp14="http://schemas.microsoft.com/office/word/2010/wordprocessingDrawing" xmlns:wp="http://schemas.openxmlformats.org/drawingml/2006/wordprocessingDrawing" xmlns:w10="urn:schemas-microsoft-com:office:word" xmlns:w="http://schemas.openxmlformats.org/wordprocessingml/2006/main" xmlns:w14="http://schemas.microsoft.com/office/word/2010/wordml" xmlns:w15="http://schemas.microsoft.com/office/word/2012/wordml" xmlns:w16cex="http://schemas.microsoft.com/office/word/2018/wordml/cex" xmlns:w16cid="http://schemas.microsoft.com/office/word/2016/wordml/cid" xmlns:w16="http://schemas.microsoft.com/office/word/2018/wordml" xmlns:w16du="http://schemas.microsoft.com/office/word/2023/wordml/word16du" xmlns:w16sdtdh="http://schemas.microsoft.com/office/word/2020/wordml/sdtdatahash" xmlns:w16se="http://schemas.microsoft.com/office/word/2015/wordml/symex" xmlns:wpg="http://schemas.microsoft.com/office/word/2010/wordprocessingGroup" xmlns:wpi="http://schemas.microsoft.com/office/word/2010/wordprocessingInk" xmlns:wne="http://schemas.microsoft.com/office/word/2006/wordml" xmlns:wps="http://schemas.microsoft.com/office/word/2010/wordprocessingShape" mc:Ignorable="w14 w15 w16se w16cid w16 w16cex w16sdtdh w16du wp14">
   <w:p>
     <w:pPr>
       <w:pStyle w:val="Footer"/>
@@ -6579,7 +6525,7 @@
 </file>
 
 <file path=word/footer2.xml><?xml version="1.0" encoding="utf-8"?>
-<w:ftr xmlns:wpc="http://schemas.microsoft.com/office/word/2010/wordprocessingCanvas" xmlns:cx="http://schemas.microsoft.com/office/drawing/2014/chartex" xmlns:cx1="http://schemas.microsoft.com/office/drawing/2015/9/8/chartex" xmlns:cx2="http://schemas.microsoft.com/office/drawing/2015/10/21/chartex" xmlns:cx3="http://schemas.microsoft.com/office/drawing/2016/5/9/chartex" xmlns:cx4="http://schemas.microsoft.com/office/drawing/2016/5/10/chartex" xmlns:cx5="http://schemas.microsoft.com/office/drawing/2016/5/11/chartex" xmlns:cx6="http://schemas.microsoft.com/office/drawing/2016/5/12/chartex" xmlns:cx7="http://schemas.microsoft.com/office/drawing/2016/5/13/chartex" xmlns:cx8="http://schemas.microsoft.com/office/drawing/2016/5/14/chartex" xmlns:mc="http://schemas.openxmlformats.org/markup-compatibility/2006" xmlns:aink="http://schemas.microsoft.com/office/drawing/2016/ink" xmlns:am3d="http://schemas.microsoft.com/office/drawing/2017/model3d" xmlns:o="urn:schemas-microsoft-com:office:office" xmlns:oel="http://schemas.microsoft.com/office/2019/extlst" xmlns:r="http://schemas.openxmlformats.org/officeDocument/2006/relationships" xmlns:m="http://schemas.openxmlformats.org/officeDocument/2006/math" xmlns:v="urn:schemas-microsoft-com:vml" xmlns:wp14="http://schemas.microsoft.com/office/word/2010/wordprocessingDrawing" xmlns:wp="http://schemas.openxmlformats.org/drawingml/2006/wordprocessingDrawing" xmlns:w10="urn:schemas-microsoft-com:office:word" xmlns:w="http://schemas.openxmlformats.org/wordprocessingml/2006/main" xmlns:w14="http://schemas.microsoft.com/office/word/2010/wordml" xmlns:w15="http://schemas.microsoft.com/office/word/2012/wordml" xmlns:w16cex="http://schemas.microsoft.com/office/word/2018/wordml/cex" xmlns:w16cid="http://schemas.microsoft.com/office/word/2016/wordml/cid" xmlns:w16="http://schemas.microsoft.com/office/word/2018/wordml" xmlns:w16sdtdh="http://schemas.microsoft.com/office/word/2020/wordml/sdtdatahash" xmlns:w16se="http://schemas.microsoft.com/office/word/2015/wordml/symex" xmlns:wpg="http://schemas.microsoft.com/office/word/2010/wordprocessingGroup" xmlns:wpi="http://schemas.microsoft.com/office/word/2010/wordprocessingInk" xmlns:wne="http://schemas.microsoft.com/office/word/2006/wordml" xmlns:wps="http://schemas.microsoft.com/office/word/2010/wordprocessingShape" mc:Ignorable="w14 w15 w16se w16cid w16 w16cex w16sdtdh wp14">
+<w:ftr xmlns:wpc="http://schemas.microsoft.com/office/word/2010/wordprocessingCanvas" xmlns:cx="http://schemas.microsoft.com/office/drawing/2014/chartex" xmlns:cx1="http://schemas.microsoft.com/office/drawing/2015/9/8/chartex" xmlns:cx2="http://schemas.microsoft.com/office/drawing/2015/10/21/chartex" xmlns:cx3="http://schemas.microsoft.com/office/drawing/2016/5/9/chartex" xmlns:cx4="http://schemas.microsoft.com/office/drawing/2016/5/10/chartex" xmlns:cx5="http://schemas.microsoft.com/office/drawing/2016/5/11/chartex" xmlns:cx6="http://schemas.microsoft.com/office/drawing/2016/5/12/chartex" xmlns:cx7="http://schemas.microsoft.com/office/drawing/2016/5/13/chartex" xmlns:cx8="http://schemas.microsoft.com/office/drawing/2016/5/14/chartex" xmlns:mc="http://schemas.openxmlformats.org/markup-compatibility/2006" xmlns:aink="http://schemas.microsoft.com/office/drawing/2016/ink" xmlns:am3d="http://schemas.microsoft.com/office/drawing/2017/model3d" xmlns:o="urn:schemas-microsoft-com:office:office" xmlns:oel="http://schemas.microsoft.com/office/2019/extlst" xmlns:r="http://schemas.openxmlformats.org/officeDocument/2006/relationships" xmlns:m="http://schemas.openxmlformats.org/officeDocument/2006/math" xmlns:v="urn:schemas-microsoft-com:vml" xmlns:wp14="http://schemas.microsoft.com/office/word/2010/wordprocessingDrawing" xmlns:wp="http://schemas.openxmlformats.org/drawingml/2006/wordprocessingDrawing" xmlns:w10="urn:schemas-microsoft-com:office:word" xmlns:w="http://schemas.openxmlformats.org/wordprocessingml/2006/main" xmlns:w14="http://schemas.microsoft.com/office/word/2010/wordml" xmlns:w15="http://schemas.microsoft.com/office/word/2012/wordml" xmlns:w16cex="http://schemas.microsoft.com/office/word/2018/wordml/cex" xmlns:w16cid="http://schemas.microsoft.com/office/word/2016/wordml/cid" xmlns:w16="http://schemas.microsoft.com/office/word/2018/wordml" xmlns:w16du="http://schemas.microsoft.com/office/word/2023/wordml/word16du" xmlns:w16sdtdh="http://schemas.microsoft.com/office/word/2020/wordml/sdtdatahash" xmlns:w16se="http://schemas.microsoft.com/office/word/2015/wordml/symex" xmlns:wpg="http://schemas.microsoft.com/office/word/2010/wordprocessingGroup" xmlns:wpi="http://schemas.microsoft.com/office/word/2010/wordprocessingInk" xmlns:wne="http://schemas.microsoft.com/office/word/2006/wordml" xmlns:wps="http://schemas.microsoft.com/office/word/2010/wordprocessingShape" mc:Ignorable="w14 w15 w16se w16cid w16 w16cex w16sdtdh w16du wp14">
   <w:p>
     <w:pPr>
       <w:pStyle w:val="Footer"/>
@@ -6720,7 +6666,23 @@
                               <w:sz w:val="17"/>
                               <w:szCs w:val="17"/>
                             </w:rPr>
-                            <w:t xml:space="preserve">© SoftUni – </w:t>
+                            <w:t xml:space="preserve">© </w:t>
+                          </w:r>
+                          <w:proofErr w:type="spellStart"/>
+                          <w:r>
+                            <w:rPr>
+                              <w:sz w:val="17"/>
+                              <w:szCs w:val="17"/>
+                            </w:rPr>
+                            <w:t>SoftUni</w:t>
+                          </w:r>
+                          <w:proofErr w:type="spellEnd"/>
+                          <w:r>
+                            <w:rPr>
+                              <w:sz w:val="17"/>
+                              <w:szCs w:val="17"/>
+                            </w:rPr>
+                            <w:t xml:space="preserve"> – </w:t>
                           </w:r>
                           <w:hyperlink r:id="rId1" w:history="1">
                             <w:r>
@@ -6740,8 +6702,8 @@
                             </w:rPr>
                             <w:t>. Copyrighted document. Unauthorized copy, reproduction or use is not permitted.</w:t>
                           </w:r>
-                          <w:bookmarkStart w:id="2" w:name="_Hlk24191091"/>
-                          <w:bookmarkEnd w:id="2"/>
+                          <w:bookmarkStart w:id="1" w:name="_Hlk24191091"/>
+                          <w:bookmarkEnd w:id="1"/>
                         </w:p>
                         <w:p>
                           <w:pPr>
@@ -7375,7 +7337,23 @@
                         <w:sz w:val="17"/>
                         <w:szCs w:val="17"/>
                       </w:rPr>
-                      <w:t xml:space="preserve">© SoftUni – </w:t>
+                      <w:t xml:space="preserve">© </w:t>
+                    </w:r>
+                    <w:proofErr w:type="spellStart"/>
+                    <w:r>
+                      <w:rPr>
+                        <w:sz w:val="17"/>
+                        <w:szCs w:val="17"/>
+                      </w:rPr>
+                      <w:t>SoftUni</w:t>
+                    </w:r>
+                    <w:proofErr w:type="spellEnd"/>
+                    <w:r>
+                      <w:rPr>
+                        <w:sz w:val="17"/>
+                        <w:szCs w:val="17"/>
+                      </w:rPr>
+                      <w:t xml:space="preserve"> – </w:t>
                     </w:r>
                     <w:hyperlink r:id="rId20" w:history="1">
                       <w:r>
@@ -7395,8 +7373,8 @@
                       </w:rPr>
                       <w:t>. Copyrighted document. Unauthorized copy, reproduction or use is not permitted.</w:t>
                     </w:r>
-                    <w:bookmarkStart w:id="3" w:name="_Hlk24191091"/>
-                    <w:bookmarkEnd w:id="3"/>
+                    <w:bookmarkStart w:id="2" w:name="_Hlk24191091"/>
+                    <w:bookmarkEnd w:id="2"/>
                   </w:p>
                   <w:p>
                     <w:pPr>
@@ -8485,7 +8463,7 @@
 </file>
 
 <file path=word/footer3.xml><?xml version="1.0" encoding="utf-8"?>
-<w:ftr xmlns:wpc="http://schemas.microsoft.com/office/word/2010/wordprocessingCanvas" xmlns:cx="http://schemas.microsoft.com/office/drawing/2014/chartex" xmlns:cx1="http://schemas.microsoft.com/office/drawing/2015/9/8/chartex" xmlns:cx2="http://schemas.microsoft.com/office/drawing/2015/10/21/chartex" xmlns:cx3="http://schemas.microsoft.com/office/drawing/2016/5/9/chartex" xmlns:cx4="http://schemas.microsoft.com/office/drawing/2016/5/10/chartex" xmlns:cx5="http://schemas.microsoft.com/office/drawing/2016/5/11/chartex" xmlns:cx6="http://schemas.microsoft.com/office/drawing/2016/5/12/chartex" xmlns:cx7="http://schemas.microsoft.com/office/drawing/2016/5/13/chartex" xmlns:cx8="http://schemas.microsoft.com/office/drawing/2016/5/14/chartex" xmlns:mc="http://schemas.openxmlformats.org/markup-compatibility/2006" xmlns:aink="http://schemas.microsoft.com/office/drawing/2016/ink" xmlns:am3d="http://schemas.microsoft.com/office/drawing/2017/model3d" xmlns:o="urn:schemas-microsoft-com:office:office" xmlns:oel="http://schemas.microsoft.com/office/2019/extlst" xmlns:r="http://schemas.openxmlformats.org/officeDocument/2006/relationships" xmlns:m="http://schemas.openxmlformats.org/officeDocument/2006/math" xmlns:v="urn:schemas-microsoft-com:vml" xmlns:wp14="http://schemas.microsoft.com/office/word/2010/wordprocessingDrawing" xmlns:wp="http://schemas.openxmlformats.org/drawingml/2006/wordprocessingDrawing" xmlns:w10="urn:schemas-microsoft-com:office:word" xmlns:w="http://schemas.openxmlformats.org/wordprocessingml/2006/main" xmlns:w14="http://schemas.microsoft.com/office/word/2010/wordml" xmlns:w15="http://schemas.microsoft.com/office/word/2012/wordml" xmlns:w16cex="http://schemas.microsoft.com/office/word/2018/wordml/cex" xmlns:w16cid="http://schemas.microsoft.com/office/word/2016/wordml/cid" xmlns:w16="http://schemas.microsoft.com/office/word/2018/wordml" xmlns:w16sdtdh="http://schemas.microsoft.com/office/word/2020/wordml/sdtdatahash" xmlns:w16se="http://schemas.microsoft.com/office/word/2015/wordml/symex" xmlns:wpg="http://schemas.microsoft.com/office/word/2010/wordprocessingGroup" xmlns:wpi="http://schemas.microsoft.com/office/word/2010/wordprocessingInk" xmlns:wne="http://schemas.microsoft.com/office/word/2006/wordml" xmlns:wps="http://schemas.microsoft.com/office/word/2010/wordprocessingShape" mc:Ignorable="w14 w15 w16se w16cid w16 w16cex w16sdtdh wp14">
+<w:ftr xmlns:wpc="http://schemas.microsoft.com/office/word/2010/wordprocessingCanvas" xmlns:cx="http://schemas.microsoft.com/office/drawing/2014/chartex" xmlns:cx1="http://schemas.microsoft.com/office/drawing/2015/9/8/chartex" xmlns:cx2="http://schemas.microsoft.com/office/drawing/2015/10/21/chartex" xmlns:cx3="http://schemas.microsoft.com/office/drawing/2016/5/9/chartex" xmlns:cx4="http://schemas.microsoft.com/office/drawing/2016/5/10/chartex" xmlns:cx5="http://schemas.microsoft.com/office/drawing/2016/5/11/chartex" xmlns:cx6="http://schemas.microsoft.com/office/drawing/2016/5/12/chartex" xmlns:cx7="http://schemas.microsoft.com/office/drawing/2016/5/13/chartex" xmlns:cx8="http://schemas.microsoft.com/office/drawing/2016/5/14/chartex" xmlns:mc="http://schemas.openxmlformats.org/markup-compatibility/2006" xmlns:aink="http://schemas.microsoft.com/office/drawing/2016/ink" xmlns:am3d="http://schemas.microsoft.com/office/drawing/2017/model3d" xmlns:o="urn:schemas-microsoft-com:office:office" xmlns:oel="http://schemas.microsoft.com/office/2019/extlst" xmlns:r="http://schemas.openxmlformats.org/officeDocument/2006/relationships" xmlns:m="http://schemas.openxmlformats.org/officeDocument/2006/math" xmlns:v="urn:schemas-microsoft-com:vml" xmlns:wp14="http://schemas.microsoft.com/office/word/2010/wordprocessingDrawing" xmlns:wp="http://schemas.openxmlformats.org/drawingml/2006/wordprocessingDrawing" xmlns:w10="urn:schemas-microsoft-com:office:word" xmlns:w="http://schemas.openxmlformats.org/wordprocessingml/2006/main" xmlns:w14="http://schemas.microsoft.com/office/word/2010/wordml" xmlns:w15="http://schemas.microsoft.com/office/word/2012/wordml" xmlns:w16cex="http://schemas.microsoft.com/office/word/2018/wordml/cex" xmlns:w16cid="http://schemas.microsoft.com/office/word/2016/wordml/cid" xmlns:w16="http://schemas.microsoft.com/office/word/2018/wordml" xmlns:w16du="http://schemas.microsoft.com/office/word/2023/wordml/word16du" xmlns:w16sdtdh="http://schemas.microsoft.com/office/word/2020/wordml/sdtdatahash" xmlns:w16se="http://schemas.microsoft.com/office/word/2015/wordml/symex" xmlns:wpg="http://schemas.microsoft.com/office/word/2010/wordprocessingGroup" xmlns:wpi="http://schemas.microsoft.com/office/word/2010/wordprocessingInk" xmlns:wne="http://schemas.microsoft.com/office/word/2006/wordml" xmlns:wps="http://schemas.microsoft.com/office/word/2010/wordprocessingShape" mc:Ignorable="w14 w15 w16se w16cid w16 w16cex w16sdtdh w16du wp14">
   <w:p>
     <w:pPr>
       <w:pStyle w:val="Footer"/>
@@ -8495,7 +8473,7 @@
 </file>
 
 <file path=word/footnotes.xml><?xml version="1.0" encoding="utf-8"?>
-<w:footnotes xmlns:wpc="http://schemas.microsoft.com/office/word/2010/wordprocessingCanvas" xmlns:cx="http://schemas.microsoft.com/office/drawing/2014/chartex" xmlns:cx1="http://schemas.microsoft.com/office/drawing/2015/9/8/chartex" xmlns:cx2="http://schemas.microsoft.com/office/drawing/2015/10/21/chartex" xmlns:cx3="http://schemas.microsoft.com/office/drawing/2016/5/9/chartex" xmlns:cx4="http://schemas.microsoft.com/office/drawing/2016/5/10/chartex" xmlns:cx5="http://schemas.microsoft.com/office/drawing/2016/5/11/chartex" xmlns:cx6="http://schemas.microsoft.com/office/drawing/2016/5/12/chartex" xmlns:cx7="http://schemas.microsoft.com/office/drawing/2016/5/13/chartex" xmlns:cx8="http://schemas.microsoft.com/office/drawing/2016/5/14/chartex" xmlns:mc="http://schemas.openxmlformats.org/markup-compatibility/2006" xmlns:aink="http://schemas.microsoft.com/office/drawing/2016/ink" xmlns:am3d="http://schemas.microsoft.com/office/drawing/2017/model3d" xmlns:o="urn:schemas-microsoft-com:office:office" xmlns:oel="http://schemas.microsoft.com/office/2019/extlst" xmlns:r="http://schemas.openxmlformats.org/officeDocument/2006/relationships" xmlns:m="http://schemas.openxmlformats.org/officeDocument/2006/math" xmlns:v="urn:schemas-microsoft-com:vml" xmlns:wp14="http://schemas.microsoft.com/office/word/2010/wordprocessingDrawing" xmlns:wp="http://schemas.openxmlformats.org/drawingml/2006/wordprocessingDrawing" xmlns:w10="urn:schemas-microsoft-com:office:word" xmlns:w="http://schemas.openxmlformats.org/wordprocessingml/2006/main" xmlns:w14="http://schemas.microsoft.com/office/word/2010/wordml" xmlns:w15="http://schemas.microsoft.com/office/word/2012/wordml" xmlns:w16cex="http://schemas.microsoft.com/office/word/2018/wordml/cex" xmlns:w16cid="http://schemas.microsoft.com/office/word/2016/wordml/cid" xmlns:w16="http://schemas.microsoft.com/office/word/2018/wordml" xmlns:w16sdtdh="http://schemas.microsoft.com/office/word/2020/wordml/sdtdatahash" xmlns:w16se="http://schemas.microsoft.com/office/word/2015/wordml/symex" xmlns:wpg="http://schemas.microsoft.com/office/word/2010/wordprocessingGroup" xmlns:wpi="http://schemas.microsoft.com/office/word/2010/wordprocessingInk" xmlns:wne="http://schemas.microsoft.com/office/word/2006/wordml" xmlns:wps="http://schemas.microsoft.com/office/word/2010/wordprocessingShape" mc:Ignorable="w14 w15 w16se w16cid w16 w16cex w16sdtdh wp14">
+<w:footnotes xmlns:wpc="http://schemas.microsoft.com/office/word/2010/wordprocessingCanvas" xmlns:cx="http://schemas.microsoft.com/office/drawing/2014/chartex" xmlns:cx1="http://schemas.microsoft.com/office/drawing/2015/9/8/chartex" xmlns:cx2="http://schemas.microsoft.com/office/drawing/2015/10/21/chartex" xmlns:cx3="http://schemas.microsoft.com/office/drawing/2016/5/9/chartex" xmlns:cx4="http://schemas.microsoft.com/office/drawing/2016/5/10/chartex" xmlns:cx5="http://schemas.microsoft.com/office/drawing/2016/5/11/chartex" xmlns:cx6="http://schemas.microsoft.com/office/drawing/2016/5/12/chartex" xmlns:cx7="http://schemas.microsoft.com/office/drawing/2016/5/13/chartex" xmlns:cx8="http://schemas.microsoft.com/office/drawing/2016/5/14/chartex" xmlns:mc="http://schemas.openxmlformats.org/markup-compatibility/2006" xmlns:aink="http://schemas.microsoft.com/office/drawing/2016/ink" xmlns:am3d="http://schemas.microsoft.com/office/drawing/2017/model3d" xmlns:o="urn:schemas-microsoft-com:office:office" xmlns:oel="http://schemas.microsoft.com/office/2019/extlst" xmlns:r="http://schemas.openxmlformats.org/officeDocument/2006/relationships" xmlns:m="http://schemas.openxmlformats.org/officeDocument/2006/math" xmlns:v="urn:schemas-microsoft-com:vml" xmlns:wp14="http://schemas.microsoft.com/office/word/2010/wordprocessingDrawing" xmlns:wp="http://schemas.openxmlformats.org/drawingml/2006/wordprocessingDrawing" xmlns:w10="urn:schemas-microsoft-com:office:word" xmlns:w="http://schemas.openxmlformats.org/wordprocessingml/2006/main" xmlns:w14="http://schemas.microsoft.com/office/word/2010/wordml" xmlns:w15="http://schemas.microsoft.com/office/word/2012/wordml" xmlns:w16cex="http://schemas.microsoft.com/office/word/2018/wordml/cex" xmlns:w16cid="http://schemas.microsoft.com/office/word/2016/wordml/cid" xmlns:w16="http://schemas.microsoft.com/office/word/2018/wordml" xmlns:w16du="http://schemas.microsoft.com/office/word/2023/wordml/word16du" xmlns:w16sdtdh="http://schemas.microsoft.com/office/word/2020/wordml/sdtdatahash" xmlns:w16se="http://schemas.microsoft.com/office/word/2015/wordml/symex" xmlns:wpg="http://schemas.microsoft.com/office/word/2010/wordprocessingGroup" xmlns:wpi="http://schemas.microsoft.com/office/word/2010/wordprocessingInk" xmlns:wne="http://schemas.microsoft.com/office/word/2006/wordml" xmlns:wps="http://schemas.microsoft.com/office/word/2010/wordprocessingShape" mc:Ignorable="w14 w15 w16se w16cid w16 w16cex w16sdtdh w16du wp14">
   <w:footnote w:type="separator" w:id="-1">
     <w:p>
       <w:pPr>
@@ -8520,7 +8498,7 @@
 </file>
 
 <file path=word/header1.xml><?xml version="1.0" encoding="utf-8"?>
-<w:hdr xmlns:wpc="http://schemas.microsoft.com/office/word/2010/wordprocessingCanvas" xmlns:cx="http://schemas.microsoft.com/office/drawing/2014/chartex" xmlns:cx1="http://schemas.microsoft.com/office/drawing/2015/9/8/chartex" xmlns:cx2="http://schemas.microsoft.com/office/drawing/2015/10/21/chartex" xmlns:cx3="http://schemas.microsoft.com/office/drawing/2016/5/9/chartex" xmlns:cx4="http://schemas.microsoft.com/office/drawing/2016/5/10/chartex" xmlns:cx5="http://schemas.microsoft.com/office/drawing/2016/5/11/chartex" xmlns:cx6="http://schemas.microsoft.com/office/drawing/2016/5/12/chartex" xmlns:cx7="http://schemas.microsoft.com/office/drawing/2016/5/13/chartex" xmlns:cx8="http://schemas.microsoft.com/office/drawing/2016/5/14/chartex" xmlns:mc="http://schemas.openxmlformats.org/markup-compatibility/2006" xmlns:aink="http://schemas.microsoft.com/office/drawing/2016/ink" xmlns:am3d="http://schemas.microsoft.com/office/drawing/2017/model3d" xmlns:o="urn:schemas-microsoft-com:office:office" xmlns:oel="http://schemas.microsoft.com/office/2019/extlst" xmlns:r="http://schemas.openxmlformats.org/officeDocument/2006/relationships" xmlns:m="http://schemas.openxmlformats.org/officeDocument/2006/math" xmlns:v="urn:schemas-microsoft-com:vml" xmlns:wp14="http://schemas.microsoft.com/office/word/2010/wordprocessingDrawing" xmlns:wp="http://schemas.openxmlformats.org/drawingml/2006/wordprocessingDrawing" xmlns:w10="urn:schemas-microsoft-com:office:word" xmlns:w="http://schemas.openxmlformats.org/wordprocessingml/2006/main" xmlns:w14="http://schemas.microsoft.com/office/word/2010/wordml" xmlns:w15="http://schemas.microsoft.com/office/word/2012/wordml" xmlns:w16cex="http://schemas.microsoft.com/office/word/2018/wordml/cex" xmlns:w16cid="http://schemas.microsoft.com/office/word/2016/wordml/cid" xmlns:w16="http://schemas.microsoft.com/office/word/2018/wordml" xmlns:w16sdtdh="http://schemas.microsoft.com/office/word/2020/wordml/sdtdatahash" xmlns:w16se="http://schemas.microsoft.com/office/word/2015/wordml/symex" xmlns:wpg="http://schemas.microsoft.com/office/word/2010/wordprocessingGroup" xmlns:wpi="http://schemas.microsoft.com/office/word/2010/wordprocessingInk" xmlns:wne="http://schemas.microsoft.com/office/word/2006/wordml" xmlns:wps="http://schemas.microsoft.com/office/word/2010/wordprocessingShape" mc:Ignorable="w14 w15 w16se w16cid w16 w16cex w16sdtdh wp14">
+<w:hdr xmlns:wpc="http://schemas.microsoft.com/office/word/2010/wordprocessingCanvas" xmlns:cx="http://schemas.microsoft.com/office/drawing/2014/chartex" xmlns:cx1="http://schemas.microsoft.com/office/drawing/2015/9/8/chartex" xmlns:cx2="http://schemas.microsoft.com/office/drawing/2015/10/21/chartex" xmlns:cx3="http://schemas.microsoft.com/office/drawing/2016/5/9/chartex" xmlns:cx4="http://schemas.microsoft.com/office/drawing/2016/5/10/chartex" xmlns:cx5="http://schemas.microsoft.com/office/drawing/2016/5/11/chartex" xmlns:cx6="http://schemas.microsoft.com/office/drawing/2016/5/12/chartex" xmlns:cx7="http://schemas.microsoft.com/office/drawing/2016/5/13/chartex" xmlns:cx8="http://schemas.microsoft.com/office/drawing/2016/5/14/chartex" xmlns:mc="http://schemas.openxmlformats.org/markup-compatibility/2006" xmlns:aink="http://schemas.microsoft.com/office/drawing/2016/ink" xmlns:am3d="http://schemas.microsoft.com/office/drawing/2017/model3d" xmlns:o="urn:schemas-microsoft-com:office:office" xmlns:oel="http://schemas.microsoft.com/office/2019/extlst" xmlns:r="http://schemas.openxmlformats.org/officeDocument/2006/relationships" xmlns:m="http://schemas.openxmlformats.org/officeDocument/2006/math" xmlns:v="urn:schemas-microsoft-com:vml" xmlns:wp14="http://schemas.microsoft.com/office/word/2010/wordprocessingDrawing" xmlns:wp="http://schemas.openxmlformats.org/drawingml/2006/wordprocessingDrawing" xmlns:w10="urn:schemas-microsoft-com:office:word" xmlns:w="http://schemas.openxmlformats.org/wordprocessingml/2006/main" xmlns:w14="http://schemas.microsoft.com/office/word/2010/wordml" xmlns:w15="http://schemas.microsoft.com/office/word/2012/wordml" xmlns:w16cex="http://schemas.microsoft.com/office/word/2018/wordml/cex" xmlns:w16cid="http://schemas.microsoft.com/office/word/2016/wordml/cid" xmlns:w16="http://schemas.microsoft.com/office/word/2018/wordml" xmlns:w16du="http://schemas.microsoft.com/office/word/2023/wordml/word16du" xmlns:w16sdtdh="http://schemas.microsoft.com/office/word/2020/wordml/sdtdatahash" xmlns:w16se="http://schemas.microsoft.com/office/word/2015/wordml/symex" xmlns:wpg="http://schemas.microsoft.com/office/word/2010/wordprocessingGroup" xmlns:wpi="http://schemas.microsoft.com/office/word/2010/wordprocessingInk" xmlns:wne="http://schemas.microsoft.com/office/word/2006/wordml" xmlns:wps="http://schemas.microsoft.com/office/word/2010/wordprocessingShape" mc:Ignorable="w14 w15 w16se w16cid w16 w16cex w16sdtdh w16du wp14">
   <w:p>
     <w:pPr>
       <w:pStyle w:val="Header"/>
@@ -8530,7 +8508,7 @@
 </file>
 
 <file path=word/header2.xml><?xml version="1.0" encoding="utf-8"?>
-<w:hdr xmlns:wpc="http://schemas.microsoft.com/office/word/2010/wordprocessingCanvas" xmlns:cx="http://schemas.microsoft.com/office/drawing/2014/chartex" xmlns:cx1="http://schemas.microsoft.com/office/drawing/2015/9/8/chartex" xmlns:cx2="http://schemas.microsoft.com/office/drawing/2015/10/21/chartex" xmlns:cx3="http://schemas.microsoft.com/office/drawing/2016/5/9/chartex" xmlns:cx4="http://schemas.microsoft.com/office/drawing/2016/5/10/chartex" xmlns:cx5="http://schemas.microsoft.com/office/drawing/2016/5/11/chartex" xmlns:cx6="http://schemas.microsoft.com/office/drawing/2016/5/12/chartex" xmlns:cx7="http://schemas.microsoft.com/office/drawing/2016/5/13/chartex" xmlns:cx8="http://schemas.microsoft.com/office/drawing/2016/5/14/chartex" xmlns:mc="http://schemas.openxmlformats.org/markup-compatibility/2006" xmlns:aink="http://schemas.microsoft.com/office/drawing/2016/ink" xmlns:am3d="http://schemas.microsoft.com/office/drawing/2017/model3d" xmlns:o="urn:schemas-microsoft-com:office:office" xmlns:oel="http://schemas.microsoft.com/office/2019/extlst" xmlns:r="http://schemas.openxmlformats.org/officeDocument/2006/relationships" xmlns:m="http://schemas.openxmlformats.org/officeDocument/2006/math" xmlns:v="urn:schemas-microsoft-com:vml" xmlns:wp14="http://schemas.microsoft.com/office/word/2010/wordprocessingDrawing" xmlns:wp="http://schemas.openxmlformats.org/drawingml/2006/wordprocessingDrawing" xmlns:w10="urn:schemas-microsoft-com:office:word" xmlns:w="http://schemas.openxmlformats.org/wordprocessingml/2006/main" xmlns:w14="http://schemas.microsoft.com/office/word/2010/wordml" xmlns:w15="http://schemas.microsoft.com/office/word/2012/wordml" xmlns:w16cex="http://schemas.microsoft.com/office/word/2018/wordml/cex" xmlns:w16cid="http://schemas.microsoft.com/office/word/2016/wordml/cid" xmlns:w16="http://schemas.microsoft.com/office/word/2018/wordml" xmlns:w16sdtdh="http://schemas.microsoft.com/office/word/2020/wordml/sdtdatahash" xmlns:w16se="http://schemas.microsoft.com/office/word/2015/wordml/symex" xmlns:wpg="http://schemas.microsoft.com/office/word/2010/wordprocessingGroup" xmlns:wpi="http://schemas.microsoft.com/office/word/2010/wordprocessingInk" xmlns:wne="http://schemas.microsoft.com/office/word/2006/wordml" xmlns:wps="http://schemas.microsoft.com/office/word/2010/wordprocessingShape" mc:Ignorable="w14 w15 w16se w16cid w16 w16cex w16sdtdh wp14">
+<w:hdr xmlns:wpc="http://schemas.microsoft.com/office/word/2010/wordprocessingCanvas" xmlns:cx="http://schemas.microsoft.com/office/drawing/2014/chartex" xmlns:cx1="http://schemas.microsoft.com/office/drawing/2015/9/8/chartex" xmlns:cx2="http://schemas.microsoft.com/office/drawing/2015/10/21/chartex" xmlns:cx3="http://schemas.microsoft.com/office/drawing/2016/5/9/chartex" xmlns:cx4="http://schemas.microsoft.com/office/drawing/2016/5/10/chartex" xmlns:cx5="http://schemas.microsoft.com/office/drawing/2016/5/11/chartex" xmlns:cx6="http://schemas.microsoft.com/office/drawing/2016/5/12/chartex" xmlns:cx7="http://schemas.microsoft.com/office/drawing/2016/5/13/chartex" xmlns:cx8="http://schemas.microsoft.com/office/drawing/2016/5/14/chartex" xmlns:mc="http://schemas.openxmlformats.org/markup-compatibility/2006" xmlns:aink="http://schemas.microsoft.com/office/drawing/2016/ink" xmlns:am3d="http://schemas.microsoft.com/office/drawing/2017/model3d" xmlns:o="urn:schemas-microsoft-com:office:office" xmlns:oel="http://schemas.microsoft.com/office/2019/extlst" xmlns:r="http://schemas.openxmlformats.org/officeDocument/2006/relationships" xmlns:m="http://schemas.openxmlformats.org/officeDocument/2006/math" xmlns:v="urn:schemas-microsoft-com:vml" xmlns:wp14="http://schemas.microsoft.com/office/word/2010/wordprocessingDrawing" xmlns:wp="http://schemas.openxmlformats.org/drawingml/2006/wordprocessingDrawing" xmlns:w10="urn:schemas-microsoft-com:office:word" xmlns:w="http://schemas.openxmlformats.org/wordprocessingml/2006/main" xmlns:w14="http://schemas.microsoft.com/office/word/2010/wordml" xmlns:w15="http://schemas.microsoft.com/office/word/2012/wordml" xmlns:w16cex="http://schemas.microsoft.com/office/word/2018/wordml/cex" xmlns:w16cid="http://schemas.microsoft.com/office/word/2016/wordml/cid" xmlns:w16="http://schemas.microsoft.com/office/word/2018/wordml" xmlns:w16du="http://schemas.microsoft.com/office/word/2023/wordml/word16du" xmlns:w16sdtdh="http://schemas.microsoft.com/office/word/2020/wordml/sdtdatahash" xmlns:w16se="http://schemas.microsoft.com/office/word/2015/wordml/symex" xmlns:wpg="http://schemas.microsoft.com/office/word/2010/wordprocessingGroup" xmlns:wpi="http://schemas.microsoft.com/office/word/2010/wordprocessingInk" xmlns:wne="http://schemas.microsoft.com/office/word/2006/wordml" xmlns:wps="http://schemas.microsoft.com/office/word/2010/wordprocessingShape" mc:Ignorable="w14 w15 w16se w16cid w16 w16cex w16sdtdh w16du wp14">
   <w:p>
     <w:pPr>
       <w:pStyle w:val="Header"/>
@@ -8541,7 +8519,7 @@
 </file>
 
 <file path=word/header3.xml><?xml version="1.0" encoding="utf-8"?>
-<w:hdr xmlns:wpc="http://schemas.microsoft.com/office/word/2010/wordprocessingCanvas" xmlns:cx="http://schemas.microsoft.com/office/drawing/2014/chartex" xmlns:cx1="http://schemas.microsoft.com/office/drawing/2015/9/8/chartex" xmlns:cx2="http://schemas.microsoft.com/office/drawing/2015/10/21/chartex" xmlns:cx3="http://schemas.microsoft.com/office/drawing/2016/5/9/chartex" xmlns:cx4="http://schemas.microsoft.com/office/drawing/2016/5/10/chartex" xmlns:cx5="http://schemas.microsoft.com/office/drawing/2016/5/11/chartex" xmlns:cx6="http://schemas.microsoft.com/office/drawing/2016/5/12/chartex" xmlns:cx7="http://schemas.microsoft.com/office/drawing/2016/5/13/chartex" xmlns:cx8="http://schemas.microsoft.com/office/drawing/2016/5/14/chartex" xmlns:mc="http://schemas.openxmlformats.org/markup-compatibility/2006" xmlns:aink="http://schemas.microsoft.com/office/drawing/2016/ink" xmlns:am3d="http://schemas.microsoft.com/office/drawing/2017/model3d" xmlns:o="urn:schemas-microsoft-com:office:office" xmlns:oel="http://schemas.microsoft.com/office/2019/extlst" xmlns:r="http://schemas.openxmlformats.org/officeDocument/2006/relationships" xmlns:m="http://schemas.openxmlformats.org/officeDocument/2006/math" xmlns:v="urn:schemas-microsoft-com:vml" xmlns:wp14="http://schemas.microsoft.com/office/word/2010/wordprocessingDrawing" xmlns:wp="http://schemas.openxmlformats.org/drawingml/2006/wordprocessingDrawing" xmlns:w10="urn:schemas-microsoft-com:office:word" xmlns:w="http://schemas.openxmlformats.org/wordprocessingml/2006/main" xmlns:w14="http://schemas.microsoft.com/office/word/2010/wordml" xmlns:w15="http://schemas.microsoft.com/office/word/2012/wordml" xmlns:w16cex="http://schemas.microsoft.com/office/word/2018/wordml/cex" xmlns:w16cid="http://schemas.microsoft.com/office/word/2016/wordml/cid" xmlns:w16="http://schemas.microsoft.com/office/word/2018/wordml" xmlns:w16sdtdh="http://schemas.microsoft.com/office/word/2020/wordml/sdtdatahash" xmlns:w16se="http://schemas.microsoft.com/office/word/2015/wordml/symex" xmlns:wpg="http://schemas.microsoft.com/office/word/2010/wordprocessingGroup" xmlns:wpi="http://schemas.microsoft.com/office/word/2010/wordprocessingInk" xmlns:wne="http://schemas.microsoft.com/office/word/2006/wordml" xmlns:wps="http://schemas.microsoft.com/office/word/2010/wordprocessingShape" mc:Ignorable="w14 w15 w16se w16cid w16 w16cex w16sdtdh wp14">
+<w:hdr xmlns:wpc="http://schemas.microsoft.com/office/word/2010/wordprocessingCanvas" xmlns:cx="http://schemas.microsoft.com/office/drawing/2014/chartex" xmlns:cx1="http://schemas.microsoft.com/office/drawing/2015/9/8/chartex" xmlns:cx2="http://schemas.microsoft.com/office/drawing/2015/10/21/chartex" xmlns:cx3="http://schemas.microsoft.com/office/drawing/2016/5/9/chartex" xmlns:cx4="http://schemas.microsoft.com/office/drawing/2016/5/10/chartex" xmlns:cx5="http://schemas.microsoft.com/office/drawing/2016/5/11/chartex" xmlns:cx6="http://schemas.microsoft.com/office/drawing/2016/5/12/chartex" xmlns:cx7="http://schemas.microsoft.com/office/drawing/2016/5/13/chartex" xmlns:cx8="http://schemas.microsoft.com/office/drawing/2016/5/14/chartex" xmlns:mc="http://schemas.openxmlformats.org/markup-compatibility/2006" xmlns:aink="http://schemas.microsoft.com/office/drawing/2016/ink" xmlns:am3d="http://schemas.microsoft.com/office/drawing/2017/model3d" xmlns:o="urn:schemas-microsoft-com:office:office" xmlns:oel="http://schemas.microsoft.com/office/2019/extlst" xmlns:r="http://schemas.openxmlformats.org/officeDocument/2006/relationships" xmlns:m="http://schemas.openxmlformats.org/officeDocument/2006/math" xmlns:v="urn:schemas-microsoft-com:vml" xmlns:wp14="http://schemas.microsoft.com/office/word/2010/wordprocessingDrawing" xmlns:wp="http://schemas.openxmlformats.org/drawingml/2006/wordprocessingDrawing" xmlns:w10="urn:schemas-microsoft-com:office:word" xmlns:w="http://schemas.openxmlformats.org/wordprocessingml/2006/main" xmlns:w14="http://schemas.microsoft.com/office/word/2010/wordml" xmlns:w15="http://schemas.microsoft.com/office/word/2012/wordml" xmlns:w16cex="http://schemas.microsoft.com/office/word/2018/wordml/cex" xmlns:w16cid="http://schemas.microsoft.com/office/word/2016/wordml/cid" xmlns:w16="http://schemas.microsoft.com/office/word/2018/wordml" xmlns:w16du="http://schemas.microsoft.com/office/word/2023/wordml/word16du" xmlns:w16sdtdh="http://schemas.microsoft.com/office/word/2020/wordml/sdtdatahash" xmlns:w16se="http://schemas.microsoft.com/office/word/2015/wordml/symex" xmlns:wpg="http://schemas.microsoft.com/office/word/2010/wordprocessingGroup" xmlns:wpi="http://schemas.microsoft.com/office/word/2010/wordprocessingInk" xmlns:wne="http://schemas.microsoft.com/office/word/2006/wordml" xmlns:wps="http://schemas.microsoft.com/office/word/2010/wordprocessingShape" mc:Ignorable="w14 w15 w16se w16cid w16 w16cex w16sdtdh w16du wp14">
   <w:p>
     <w:pPr>
       <w:pStyle w:val="Header"/>
@@ -8551,7 +8529,7 @@
 </file>
 
 <file path=word/numbering.xml><?xml version="1.0" encoding="utf-8"?>
-<w:numbering xmlns:wpc="http://schemas.microsoft.com/office/word/2010/wordprocessingCanvas" xmlns:cx="http://schemas.microsoft.com/office/drawing/2014/chartex" xmlns:cx1="http://schemas.microsoft.com/office/drawing/2015/9/8/chartex" xmlns:cx2="http://schemas.microsoft.com/office/drawing/2015/10/21/chartex" xmlns:cx3="http://schemas.microsoft.com/office/drawing/2016/5/9/chartex" xmlns:cx4="http://schemas.microsoft.com/office/drawing/2016/5/10/chartex" xmlns:cx5="http://schemas.microsoft.com/office/drawing/2016/5/11/chartex" xmlns:cx6="http://schemas.microsoft.com/office/drawing/2016/5/12/chartex" xmlns:cx7="http://schemas.microsoft.com/office/drawing/2016/5/13/chartex" xmlns:cx8="http://schemas.microsoft.com/office/drawing/2016/5/14/chartex" xmlns:mc="http://schemas.openxmlformats.org/markup-compatibility/2006" xmlns:aink="http://schemas.microsoft.com/office/drawing/2016/ink" xmlns:am3d="http://schemas.microsoft.com/office/drawing/2017/model3d" xmlns:o="urn:schemas-microsoft-com:office:office" xmlns:oel="http://schemas.microsoft.com/office/2019/extlst" xmlns:r="http://schemas.openxmlformats.org/officeDocument/2006/relationships" xmlns:m="http://schemas.openxmlformats.org/officeDocument/2006/math" xmlns:v="urn:schemas-microsoft-com:vml" xmlns:wp14="http://schemas.microsoft.com/office/word/2010/wordprocessingDrawing" xmlns:wp="http://schemas.openxmlformats.org/drawingml/2006/wordprocessingDrawing" xmlns:w10="urn:schemas-microsoft-com:office:word" xmlns:w="http://schemas.openxmlformats.org/wordprocessingml/2006/main" xmlns:w14="http://schemas.microsoft.com/office/word/2010/wordml" xmlns:w15="http://schemas.microsoft.com/office/word/2012/wordml" xmlns:w16cex="http://schemas.microsoft.com/office/word/2018/wordml/cex" xmlns:w16cid="http://schemas.microsoft.com/office/word/2016/wordml/cid" xmlns:w16="http://schemas.microsoft.com/office/word/2018/wordml" xmlns:w16sdtdh="http://schemas.microsoft.com/office/word/2020/wordml/sdtdatahash" xmlns:w16se="http://schemas.microsoft.com/office/word/2015/wordml/symex" xmlns:wpg="http://schemas.microsoft.com/office/word/2010/wordprocessingGroup" xmlns:wpi="http://schemas.microsoft.com/office/word/2010/wordprocessingInk" xmlns:wne="http://schemas.microsoft.com/office/word/2006/wordml" xmlns:wps="http://schemas.microsoft.com/office/word/2010/wordprocessingShape" mc:Ignorable="w14 w15 w16se w16cid w16 w16cex w16sdtdh wp14">
+<w:numbering xmlns:wpc="http://schemas.microsoft.com/office/word/2010/wordprocessingCanvas" xmlns:cx="http://schemas.microsoft.com/office/drawing/2014/chartex" xmlns:cx1="http://schemas.microsoft.com/office/drawing/2015/9/8/chartex" xmlns:cx2="http://schemas.microsoft.com/office/drawing/2015/10/21/chartex" xmlns:cx3="http://schemas.microsoft.com/office/drawing/2016/5/9/chartex" xmlns:cx4="http://schemas.microsoft.com/office/drawing/2016/5/10/chartex" xmlns:cx5="http://schemas.microsoft.com/office/drawing/2016/5/11/chartex" xmlns:cx6="http://schemas.microsoft.com/office/drawing/2016/5/12/chartex" xmlns:cx7="http://schemas.microsoft.com/office/drawing/2016/5/13/chartex" xmlns:cx8="http://schemas.microsoft.com/office/drawing/2016/5/14/chartex" xmlns:mc="http://schemas.openxmlformats.org/markup-compatibility/2006" xmlns:aink="http://schemas.microsoft.com/office/drawing/2016/ink" xmlns:am3d="http://schemas.microsoft.com/office/drawing/2017/model3d" xmlns:o="urn:schemas-microsoft-com:office:office" xmlns:oel="http://schemas.microsoft.com/office/2019/extlst" xmlns:r="http://schemas.openxmlformats.org/officeDocument/2006/relationships" xmlns:m="http://schemas.openxmlformats.org/officeDocument/2006/math" xmlns:v="urn:schemas-microsoft-com:vml" xmlns:wp14="http://schemas.microsoft.com/office/word/2010/wordprocessingDrawing" xmlns:wp="http://schemas.openxmlformats.org/drawingml/2006/wordprocessingDrawing" xmlns:w10="urn:schemas-microsoft-com:office:word" xmlns:w="http://schemas.openxmlformats.org/wordprocessingml/2006/main" xmlns:w14="http://schemas.microsoft.com/office/word/2010/wordml" xmlns:w15="http://schemas.microsoft.com/office/word/2012/wordml" xmlns:w16cex="http://schemas.microsoft.com/office/word/2018/wordml/cex" xmlns:w16cid="http://schemas.microsoft.com/office/word/2016/wordml/cid" xmlns:w16="http://schemas.microsoft.com/office/word/2018/wordml" xmlns:w16du="http://schemas.microsoft.com/office/word/2023/wordml/word16du" xmlns:w16sdtdh="http://schemas.microsoft.com/office/word/2020/wordml/sdtdatahash" xmlns:w16se="http://schemas.microsoft.com/office/word/2015/wordml/symex" xmlns:wpg="http://schemas.microsoft.com/office/word/2010/wordprocessingGroup" xmlns:wpi="http://schemas.microsoft.com/office/word/2010/wordprocessingInk" xmlns:wne="http://schemas.microsoft.com/office/word/2006/wordml" xmlns:wps="http://schemas.microsoft.com/office/word/2010/wordprocessingShape" mc:Ignorable="w14 w15 w16se w16cid w16 w16cex w16sdtdh w16du wp14">
   <w:abstractNum w:abstractNumId="0" w15:restartNumberingAfterBreak="0">
     <w:nsid w:val="03AD2F9A"/>
     <w:multiLevelType w:val="hybridMultilevel"/>
@@ -12568,7 +12546,7 @@
 </file>
 
 <file path=word/styles.xml><?xml version="1.0" encoding="utf-8"?>
-<w:styles xmlns:mc="http://schemas.openxmlformats.org/markup-compatibility/2006" xmlns:r="http://schemas.openxmlformats.org/officeDocument/2006/relationships" xmlns:w="http://schemas.openxmlformats.org/wordprocessingml/2006/main" xmlns:w14="http://schemas.microsoft.com/office/word/2010/wordml" xmlns:w15="http://schemas.microsoft.com/office/word/2012/wordml" xmlns:w16cex="http://schemas.microsoft.com/office/word/2018/wordml/cex" xmlns:w16cid="http://schemas.microsoft.com/office/word/2016/wordml/cid" xmlns:w16="http://schemas.microsoft.com/office/word/2018/wordml" xmlns:w16sdtdh="http://schemas.microsoft.com/office/word/2020/wordml/sdtdatahash" xmlns:w16se="http://schemas.microsoft.com/office/word/2015/wordml/symex" mc:Ignorable="w14 w15 w16se w16cid w16 w16cex w16sdtdh">
+<w:styles xmlns:mc="http://schemas.openxmlformats.org/markup-compatibility/2006" xmlns:r="http://schemas.openxmlformats.org/officeDocument/2006/relationships" xmlns:w="http://schemas.openxmlformats.org/wordprocessingml/2006/main" xmlns:w14="http://schemas.microsoft.com/office/word/2010/wordml" xmlns:w15="http://schemas.microsoft.com/office/word/2012/wordml" xmlns:w16cex="http://schemas.microsoft.com/office/word/2018/wordml/cex" xmlns:w16cid="http://schemas.microsoft.com/office/word/2016/wordml/cid" xmlns:w16="http://schemas.microsoft.com/office/word/2018/wordml" xmlns:w16du="http://schemas.microsoft.com/office/word/2023/wordml/word16du" xmlns:w16sdtdh="http://schemas.microsoft.com/office/word/2020/wordml/sdtdatahash" xmlns:w16se="http://schemas.microsoft.com/office/word/2015/wordml/symex" mc:Ignorable="w14 w15 w16se w16cid w16 w16cex w16sdtdh w16du">
   <w:docDefaults>
     <w:rPrDefault>
       <w:rPr>

</xml_diff>